<commit_message>
Update Solution Overview: aligned five-stage diagram, new customer-environment architecture diagram, remove SIEM/SOAR + version line
Co-Authored-By: Claude Opus 4.8 (1M context) <noreply@anthropic.com>
</commit_message>
<xml_diff>
--- a/axia-solution-overview.docx
+++ b/axia-solution-overview.docx
@@ -71,20 +71,6 @@
           <w:sz w:val="22"/>
         </w:rPr>
         <w:t>Audience: CISO  •  Head of Security Architecture  •  Data Protection Lead</w:t>
-      </w:r>
-    </w:p>
-    <w:p/>
-    <w:p>
-      <w:pPr>
-        <w:jc w:val="center"/>
-      </w:pPr>
-      <w:r>
-        <w:rPr>
-          <w:rFonts w:ascii="Calibri" w:hAnsi="Calibri"/>
-          <w:color w:val="666666"/>
-          <w:sz w:val="22"/>
-        </w:rPr>
-        <w:t>Version 2.0  •  Derived from PRD V2 and V6.30.1 demo family</w:t>
       </w:r>
     </w:p>
     <w:p/>
@@ -1024,7 +1010,7 @@
       <w:r>
         <w:drawing>
           <wp:inline xmlns:a="http://schemas.openxmlformats.org/drawingml/2006/main" xmlns:pic="http://schemas.openxmlformats.org/drawingml/2006/picture">
-            <wp:extent cx="5943600" cy="1862328"/>
+            <wp:extent cx="5943600" cy="1928368"/>
             <wp:docPr id="2" name="Picture 2"/>
             <wp:cNvGraphicFramePr>
               <a:graphicFrameLocks noChangeAspect="1"/>
@@ -1045,7 +1031,7 @@
                   <pic:spPr>
                     <a:xfrm>
                       <a:off x="0" y="0"/>
-                      <a:ext cx="5943600" cy="1862328"/>
+                      <a:ext cx="5943600" cy="1928368"/>
                     </a:xfrm>
                     <a:prstGeom prst="rect"/>
                   </pic:spPr>
@@ -1618,7 +1604,7 @@
                 <w:rFonts w:ascii="Calibri" w:hAnsi="Calibri"/>
                 <w:sz w:val="20"/>
               </w:rPr>
-              <w:t>Generic SIEM / Syslog</w:t>
+              <w:t>Generic DLP / Syslog</w:t>
             </w:r>
           </w:p>
         </w:tc>
@@ -1654,7 +1640,7 @@
                 <w:rFonts w:ascii="Calibri" w:hAnsi="Calibri"/>
                 <w:sz w:val="20"/>
               </w:rPr>
-              <w:t>Universal path — any DLP or SIEM that exports to Syslog</w:t>
+              <w:t>Universal path — any DLP that exports to Syslog</w:t>
             </w:r>
           </w:p>
         </w:tc>
@@ -2487,82 +2473,6 @@
     </w:p>
     <w:p>
       <w:pPr>
-        <w:pStyle w:val="Heading3"/>
-      </w:pPr>
-      <w:r>
-        <w:rPr>
-          <w:rFonts w:ascii="Calibri" w:hAnsi="Calibri"/>
-          <w:b/>
-          <w:color w:val="0A5563"/>
-          <w:sz w:val="26"/>
-        </w:rPr>
-        <w:t>SIEM / SOAR</w:t>
-      </w:r>
-    </w:p>
-    <w:p>
-      <w:r>
-        <w:rPr>
-          <w:rFonts w:ascii="Calibri" w:hAnsi="Calibri"/>
-          <w:sz w:val="22"/>
-        </w:rPr>
-        <w:t>AXIA cases export to your SIEM — Splunk, Microsoft Sentinel, IBM QRadar, Chronicle — as structured events over the standard CEF / Syslog path, so insider-risk cases land alongside the rest of your security telemetry.</w:t>
-      </w:r>
-    </w:p>
-    <w:p>
-      <w:pPr>
-        <w:jc w:val="center"/>
-      </w:pPr>
-      <w:r>
-        <w:drawing>
-          <wp:inline xmlns:a="http://schemas.openxmlformats.org/drawingml/2006/main" xmlns:pic="http://schemas.openxmlformats.org/drawingml/2006/picture">
-            <wp:extent cx="5943600" cy="3051048"/>
-            <wp:docPr id="3" name="Picture 3"/>
-            <wp:cNvGraphicFramePr>
-              <a:graphicFrameLocks noChangeAspect="1"/>
-            </wp:cNvGraphicFramePr>
-            <a:graphic>
-              <a:graphicData uri="http://schemas.openxmlformats.org/drawingml/2006/picture">
-                <pic:pic>
-                  <pic:nvPicPr>
-                    <pic:cNvPr id="0" name="D11-integration-ecosystem-map.png"/>
-                    <pic:cNvPicPr/>
-                  </pic:nvPicPr>
-                  <pic:blipFill>
-                    <a:blip r:embed="rId11"/>
-                    <a:stretch>
-                      <a:fillRect/>
-                    </a:stretch>
-                  </pic:blipFill>
-                  <pic:spPr>
-                    <a:xfrm>
-                      <a:off x="0" y="0"/>
-                      <a:ext cx="5943600" cy="3051048"/>
-                    </a:xfrm>
-                    <a:prstGeom prst="rect"/>
-                  </pic:spPr>
-                </pic:pic>
-              </a:graphicData>
-            </a:graphic>
-          </wp:inline>
-        </w:drawing>
-      </w:r>
-    </w:p>
-    <w:p>
-      <w:pPr>
-        <w:spacing w:after="200"/>
-        <w:jc w:val="center"/>
-      </w:pPr>
-      <w:r>
-        <w:rPr>
-          <w:i/>
-          <w:color w:val="666666"/>
-          <w:sz w:val="19"/>
-        </w:rPr>
-        <w:t>Integration ecosystem map — DLP signal sources, identity &amp; HR context, communication channels, and SIEM/SOAR endpoints.</w:t>
-      </w:r>
-    </w:p>
-    <w:p>
-      <w:pPr>
         <w:jc w:val="center"/>
       </w:pPr>
       <w:r>
@@ -3201,6 +3111,59 @@
       <w:pPr>
         <w:spacing w:before="80"/>
       </w:pPr>
+    </w:p>
+    <w:p>
+      <w:pPr>
+        <w:jc w:val="center"/>
+      </w:pPr>
+      <w:r>
+        <w:drawing>
+          <wp:inline xmlns:a="http://schemas.openxmlformats.org/drawingml/2006/main" xmlns:pic="http://schemas.openxmlformats.org/drawingml/2006/picture">
+            <wp:extent cx="5943600" cy="4015232"/>
+            <wp:docPr id="3" name="Picture 3"/>
+            <wp:cNvGraphicFramePr>
+              <a:graphicFrameLocks noChangeAspect="1"/>
+            </wp:cNvGraphicFramePr>
+            <a:graphic>
+              <a:graphicData uri="http://schemas.openxmlformats.org/drawingml/2006/picture">
+                <pic:pic>
+                  <pic:nvPicPr>
+                    <pic:cNvPr id="0" name="D15-customer-environment-architecture.png"/>
+                    <pic:cNvPicPr/>
+                  </pic:nvPicPr>
+                  <pic:blipFill>
+                    <a:blip r:embed="rId11"/>
+                    <a:stretch>
+                      <a:fillRect/>
+                    </a:stretch>
+                  </pic:blipFill>
+                  <pic:spPr>
+                    <a:xfrm>
+                      <a:off x="0" y="0"/>
+                      <a:ext cx="5943600" cy="4015232"/>
+                    </a:xfrm>
+                    <a:prstGeom prst="rect"/>
+                  </pic:spPr>
+                </pic:pic>
+              </a:graphicData>
+            </a:graphic>
+          </wp:inline>
+        </w:drawing>
+      </w:r>
+    </w:p>
+    <w:p>
+      <w:pPr>
+        <w:spacing w:after="200"/>
+        <w:jc w:val="center"/>
+      </w:pPr>
+      <w:r>
+        <w:rPr>
+          <w:i/>
+          <w:color w:val="666666"/>
+          <w:sz w:val="19"/>
+        </w:rPr>
+        <w:t>AXIA deployed in the customer's environment — the two-tier engine (local Gatekeeper + LLM Judge), the customer-owned LLM endpoint (Bedrock / Azure OpenAI / Vertex AI for Private Cloud; customer-provided open-weights for On-Premises; AXIA-provided fallback), the integration surface (communication channels, DLP, identity &amp; HRIS), and the closed-loop outputs. Content never leaves the customer perimeter.</w:t>
+      </w:r>
     </w:p>
     <w:p>
       <w:pPr>

</xml_diff>

<commit_message>
Solution Overview: drop SOC2/ISO in-progress claims, replace cover tagline with 'Understand first. Engage second. Enforce last.', contact email info@
Co-Authored-By: Claude Fable 5 <noreply@anthropic.com>
</commit_message>
<xml_diff>
--- a/axia-solution-overview.docx
+++ b/axia-solution-overview.docx
@@ -90,7 +90,7 @@
           <w:color w:val="0D9488"/>
           <w:sz w:val="28"/>
         </w:rPr>
-        <w:t>"The CISO's Front-Line AI for Insider Risk"</w:t>
+        <w:t>"Understand first. Engage second. Enforce last."</w:t>
       </w:r>
     </w:p>
     <w:p>
@@ -102,7 +102,7 @@
           <w:color w:val="666666"/>
           <w:sz w:val="20"/>
         </w:rPr>
-        <w:t>axiasecurity.io  •  hello@axiasecurity.io</w:t>
+        <w:t>axiasecurity.io  •  info@axiasecurity.io</w:t>
       </w:r>
     </w:p>
     <w:p>
@@ -3411,7 +3411,7 @@
           <w:rFonts w:ascii="Calibri" w:hAnsi="Calibri"/>
           <w:sz w:val="22"/>
         </w:rPr>
-        <w:t>SOC 2 Type II framework adopted, audit in progress. ISO 27001 readiness in flight. Data-processing agreement (DPA) shipped as part of the standard EULA. GDPR, CCPA, and equivalent regulatory frameworks supported at the data-flow and consent layers.</w:t>
+        <w:t>Data-processing agreement (DPA) shipped as part of the standard EULA. GDPR, CCPA, and equivalent regulatory frameworks supported at the data-flow and consent layers.</w:t>
       </w:r>
     </w:p>
     <w:p>
@@ -5525,7 +5525,7 @@
           <w:color w:val="666666"/>
           <w:sz w:val="20"/>
         </w:rPr>
-        <w:t>AXIA Security  •  axiasecurity.io  •  hello@axiasecurity.io</w:t>
+        <w:t>AXIA Security  •  axiasecurity.io  •  info@axiasecurity.io</w:t>
       </w:r>
     </w:p>
     <w:sectPr>

</xml_diff>

<commit_message>
Solution Overview: move exact Gatekeeper benchmarks under NDA framing; unify contact to info@
Co-Authored-By: Claude Fable 5 <noreply@anthropic.com>
</commit_message>
<xml_diff>
--- a/axia-solution-overview.docx
+++ b/axia-solution-overview.docx
@@ -499,37 +499,7 @@
           <w:rFonts w:ascii="Calibri" w:hAnsi="Calibri"/>
           <w:sz w:val="22"/>
         </w:rPr>
-        <w:t xml:space="preserve"> — primary classifier, V4 production baseline at </w:t>
-      </w:r>
-      <w:r>
-        <w:rPr>
-          <w:rFonts w:ascii="Calibri" w:hAnsi="Calibri"/>
-          <w:b/>
-          <w:sz w:val="22"/>
-        </w:rPr>
-        <w:t>80.4% exact-match accuracy</w:t>
-      </w:r>
-      <w:r>
-        <w:rPr>
-          <w:rFonts w:ascii="Calibri" w:hAnsi="Calibri"/>
-          <w:sz w:val="22"/>
-        </w:rPr>
-        <w:t xml:space="preserve"> on the five-level severity taxonomy (Critical / High / Medium / Low / Non-sensitive), </w:t>
-      </w:r>
-      <w:r>
-        <w:rPr>
-          <w:rFonts w:ascii="Calibri" w:hAnsi="Calibri"/>
-          <w:b/>
-          <w:sz w:val="22"/>
-        </w:rPr>
-        <w:t>Cohen's Quadratic Weighted Kappa 0.920</w:t>
-      </w:r>
-      <w:r>
-        <w:rPr>
-          <w:rFonts w:ascii="Calibri" w:hAnsi="Calibri"/>
-          <w:sz w:val="22"/>
-        </w:rPr>
-        <w:t xml:space="preserve"> — meaning when the Gatekeeper is wrong, it is off by one level, never catastrophically.</w:t>
+        <w:t xml:space="preserve"> — primary classifier, production-validated on the five-level severity taxonomy (Critical / High / Medium / Low / Non-sensitive). In benchmark evaluation its errors concentrate one severity level away rather than at the extremes. Full benchmark methodology and figures shared under NDA during technical evaluation.</w:t>
       </w:r>
     </w:p>
     <w:p>
@@ -5473,7 +5443,7 @@
           <w:rFonts w:ascii="Calibri" w:hAnsi="Calibri"/>
           <w:sz w:val="22"/>
         </w:rPr>
-        <w:t xml:space="preserve"> hello@axiasecurity.io · axiasecurity.io</w:t>
+        <w:t xml:space="preserve"> info@axiasecurity.io · axiasecurity.io</w:t>
       </w:r>
     </w:p>
     <w:p>

</xml_diff>